<commit_message>
Add decision analysis and integrity audit scripts
- Implemented `figures_decision.py` to generate decision analysis figures, including the scissors figure and leadtime figure, based on forecast skill and decision loss.
- Created `forecast_leadtime.py` to assess the skill of forecasts issued at various points during the season, utilizing a leave-one-year-out protocol.
- Developed `integrity_audit.py` to audit the integrity of the dataset, checking for genuine rows, cross-referencing with source labels, and evaluating the impact of data augmentation.
- Introduced `weather_forecast.py` to handle weather forecasting by resampling historical weather data, addressing bias and uncertainty in predictions.
</commit_message>
<xml_diff>
--- a/outputs/Final_Report_AgroAI.docx
+++ b/outputs/Final_Report_AgroAI.docx
@@ -15795,6 +15795,30 @@
           <w:rFonts w:ascii="Times New Roman" w:hAnsi="Times New Roman"/>
           <w:sz w:val="24"/>
         </w:rPr>
+        <w:t>The scale of the distortion can be measured directly. Holding the model and features fixed and changing only the validation protocol, a random five-fold split over the augmented file returns an R² of 0.552, while leave-one-year-out over the genuine rows alone returns 0.044 — an inflation of roughly twelve-fold, produced entirely by allowing fabricated near-duplicates of a training row to appear in the test fold. Augmentation was also tested in the correct manner, with test folds restricted to genuine rows and only the training set augmented; every variant degraded honest performance monotonically, from 0.044 with no augmentation to −0.747 at a twenty-fold synthetic multiple. Synthetic rows copy the information already present and add noise; they cannot create signal.</w:t>
+      </w:r>
+    </w:p>
+    <w:p>
+      <w:pPr>
+        <w:jc w:val="both"/>
+      </w:pPr>
+      <w:r>
+        <w:rPr>
+          <w:rFonts w:ascii="Times New Roman" w:hAnsi="Times New Roman"/>
+          <w:sz w:val="24"/>
+        </w:rPr>
+        <w:t>The correction was initially applied only to the evaluation pipeline. An audit of the serving layer found that the deployed dashboard was still loading a model trained on the uncorrected panel, and further that it reported the accuracy of a model it was not serving: the evaluator had crowned a physics-residual variant with no loadable artefact, so the application silently fell back to gradient boosting while continuing to display the physics-residual R² of 0.0908 in place of gradient boosting's own 0.012. Both faults are corrected in the submitted system. Filtering the fabricated rows from the legacy pipeline moves twenty-four of the twenty-eight targets, by 3.41 metric tons per hectare on average and by as much as 11.98, and every model's score falls: the physics-residual variant's headline 0.091 becomes −0.508, and no model retains a positive R². The earlier figures were in part sustained by fabricated data.</w:t>
+      </w:r>
+    </w:p>
+    <w:p>
+      <w:pPr>
+        <w:jc w:val="both"/>
+      </w:pPr>
+      <w:r>
+        <w:rPr>
+          <w:rFonts w:ascii="Times New Roman" w:hAnsi="Times New Roman"/>
+          <w:sz w:val="24"/>
+        </w:rPr>
         <w:t>Two parsing faults were found and corrected in the process, either of which silently corrupts the panel. Production values are written with thousands separators in two records, which parse to missing values unless the reader is told to expect them; that alone had been rendering Matale 2020 as 0.53 rather than 12.16 metric tons per hectare. Separately, zero is a missing-data code for the second vegetation-index composite and for all three soil columns, but a genuine measurement for extent and production, and the two cases must be distinguished.</w:t>
       </w:r>
     </w:p>
@@ -21406,7 +21430,7 @@
           <w:i/>
           <w:sz w:val="22"/>
         </w:rPr>
-        <w:t>Table 7.11: Detection power at simulated weather-signal strengths</w:t>
+        <w:t>Table 7.10: Detection power at simulated weather-signal strengths</w:t>
       </w:r>
     </w:p>
     <w:tbl>
@@ -21796,7 +21820,7 @@
           <w:rFonts w:ascii="Times New Roman" w:hAnsi="Times New Roman"/>
           <w:sz w:val="24"/>
         </w:rPr>
-        <w:t>The same machinery answers a second question: which constants are identifiable at this sample size. Table 7.12 fits PADR to data generated from known values and reports the error as a share of each parameter's admissible range, taking under ten per cent as recovered.</w:t>
+        <w:t>The same machinery answers a second question: which constants are identifiable at this sample size. Table 7.11 fits PADR to data generated from known values and reports the error as a share of each parameter's admissible range, taking under ten per cent as recovered.</w:t>
       </w:r>
     </w:p>
     <w:p>
@@ -21811,7 +21835,7 @@
           <w:i/>
           <w:sz w:val="22"/>
         </w:rPr>
-        <w:t>Table 7.12: Parameter recovery at n = 28</w:t>
+        <w:t>Table 7.11: Parameter recovery at n = 28</w:t>
       </w:r>
     </w:p>
     <w:tbl>
@@ -22649,7 +22673,7 @@
           <w:i/>
           <w:sz w:val="22"/>
         </w:rPr>
-        <w:t>Table 7.10: Year-blocked cross-conformal intervals at a nominal 90 per cent</w:t>
+        <w:t>Table 7.12: Year-blocked cross-conformal intervals at a nominal 90 per cent</w:t>
       </w:r>
     </w:p>
     <w:tbl>
@@ -23088,7 +23112,7 @@
           <w:b/>
           <w:sz w:val="24"/>
         </w:rPr>
-        <w:t>7.12 Per-District Behaviour</w:t>
+        <w:t>7.12 Forecasting Under Unknown Weather</w:t>
       </w:r>
     </w:p>
     <w:p>
@@ -23100,7 +23124,7 @@
           <w:rFonts w:ascii="Times New Roman" w:hAnsi="Times New Roman"/>
           <w:sz w:val="24"/>
         </w:rPr>
-        <w:t>District-level differences are small and, given section 7.5, expected to be: only 2.2 per cent of the target's variance lies between districts. The estimated district offsets span 0.34 metric tons per hectare in total, which is smaller than the measurement error of a single cell.</w:t>
+        <w:t>Every result reported so far, and most results in the yield-prediction literature, are computed with the season's weather already in hand. No forecaster is ever in that position. A forecast issued before the harvest must be built only from quantities known at the moment it is issued, and the weather of the season being predicted is not one of them.</w:t>
       </w:r>
     </w:p>
     <w:p>
@@ -23112,13 +23136,982 @@
           <w:rFonts w:ascii="Times New Roman" w:hAnsi="Times New Roman"/>
           <w:sz w:val="24"/>
         </w:rPr>
-        <w:t>Kurunegala warrants separate comment. Its harvested extent ranges from 3.5 to 59 hectares against Matale's 104 to 1,765, so its yield estimates are inherently the noisiest in the panel; it shares a weather grid cell with Matale, so it has no independent meteorological observation; its vegetation index is a Matale proxy, no MODIS export being available; and its soil profile is absent from the SoilGrids export. Its apparent difficulty in the interim report is therefore substantially an artefact of observation quality rather than a property of the district's agronomy. The extent weighting introduced in section 7.3 down-weights it accordingly.</w:t>
+        <w:t>Of the thirty-two features, only nine can be known before the season begins: five historical yield terms and four soil terms. The nine weather, eleven satellite and three interaction features are unknowable until the season has ended. Two of the nine knowable features are hardcoded constants, so approximately five carry information at forecast time. The eleven satellite features are the hardest case, because a vegetation index depends on the crop that was actually planted and cannot be forecast at all.</w:t>
+      </w:r>
+    </w:p>
+    <w:p>
+      <w:pPr>
+        <w:jc w:val="both"/>
+      </w:pPr>
+      <w:r>
+        <w:rPr>
+          <w:rFonts w:ascii="Times New Roman" w:hAnsi="Times New Roman"/>
+          <w:sz w:val="24"/>
+        </w:rPr>
+        <w:t>The serving layer substituted the district-season historical mean for every unknown feature and then treated that mean as a known quantity. Two distinct errors follow. The first is bias: the models are nonlinear, so the prediction at average weather is not the average prediction across possible weathers. Evaluated against the seven observed years, the discrepancy reaches 1.48 metric tons per hectare. The second is understated uncertainty: a conformal band measures model error given the features, and contains no allowance for not knowing the features at all. Propagating the weather-driven spread widens the nominal ninety per cent band from plus or minus 8.03 to approximately plus or minus 10.35 metric tons per hectare, so the interval as displayed was about seventy-eight per cent of the width it should have been.</w:t>
+      </w:r>
+    </w:p>
+    <w:p>
+      <w:pPr>
+        <w:jc w:val="both"/>
+      </w:pPr>
+      <w:r>
+        <w:rPr>
+          <w:rFonts w:ascii="Times New Roman" w:hAnsi="Times New Roman"/>
+          <w:sz w:val="24"/>
+        </w:rPr>
+        <w:t>The remedy implemented here is Monte Carlo propagation. At a given issue point the season is split: months already past take that year's measured weather, and every remaining month is resampled two hundred times from a forty-five-year NASA POWER analogue pool covering 1981 to 2025. Two design choices determine whether this is correct. Complete analogue years are resampled rather than individual features, because drawing rainfall from one year and temperature from another manufactures weather that cannot physically occur. And each sampled year contributes the shape of its anomaly, which is then expressed in the evaluation panel's own mean and standard deviation, so the sampled vectors remain on the distribution the models were fitted to. The weather distribution is therefore estimated from forty-five years while the yield relationship is estimated from seven; each uses the largest record available to it.</w:t>
       </w:r>
     </w:p>
     <w:p>
       <w:pPr>
         <w:keepNext/>
         <w:spacing w:before="240" w:after="120"/>
+        <w:jc w:val="center"/>
+      </w:pPr>
+      <w:r>
+        <w:rPr>
+          <w:rFonts w:ascii="Times New Roman" w:hAnsi="Times New Roman"/>
+          <w:i/>
+          <w:sz w:val="22"/>
+        </w:rPr>
+        <w:t>Table 7.13: Forecast skill against issue point, weather-only, Leave-One-Year-Out with 200 weather samples per cell</w:t>
+      </w:r>
+    </w:p>
+    <w:tbl>
+      <w:tblPr>
+        <w:tblStyle w:val="TableGrid"/>
+        <w:tblW w:type="auto" w:w="0"/>
+        <w:jc w:val="center"/>
+        <w:tblLook w:firstColumn="1" w:firstRow="1" w:lastColumn="0" w:lastRow="0" w:noHBand="0" w:noVBand="1" w:val="04A0"/>
+      </w:tblPr>
+      <w:tblGrid>
+        <w:gridCol w:w="1662"/>
+        <w:gridCol w:w="1662"/>
+        <w:gridCol w:w="1662"/>
+        <w:gridCol w:w="1662"/>
+        <w:gridCol w:w="1662"/>
+      </w:tblGrid>
+      <w:tr>
+        <w:tc>
+          <w:tcPr>
+            <w:tcW w:type="dxa" w:w="1662"/>
+          </w:tcPr>
+          <w:p>
+            <w:pPr>
+              <w:spacing w:line="240" w:lineRule="auto" w:after="40"/>
+            </w:pPr>
+            <w:r/>
+            <w:r>
+              <w:rPr>
+                <w:rFonts w:ascii="Times New Roman" w:hAnsi="Times New Roman"/>
+                <w:b/>
+                <w:sz w:val="20"/>
+              </w:rPr>
+              <w:t>Forecast issued</w:t>
+            </w:r>
+          </w:p>
+        </w:tc>
+        <w:tc>
+          <w:tcPr>
+            <w:tcW w:type="dxa" w:w="1662"/>
+          </w:tcPr>
+          <w:p>
+            <w:pPr>
+              <w:spacing w:line="240" w:lineRule="auto" w:after="40"/>
+            </w:pPr>
+            <w:r/>
+            <w:r>
+              <w:rPr>
+                <w:rFonts w:ascii="Times New Roman" w:hAnsi="Times New Roman"/>
+                <w:b/>
+                <w:sz w:val="20"/>
+              </w:rPr>
+              <w:t>Months observed</w:t>
+            </w:r>
+          </w:p>
+        </w:tc>
+        <w:tc>
+          <w:tcPr>
+            <w:tcW w:type="dxa" w:w="1662"/>
+          </w:tcPr>
+          <w:p>
+            <w:pPr>
+              <w:spacing w:line="240" w:lineRule="auto" w:after="40"/>
+            </w:pPr>
+            <w:r/>
+            <w:r>
+              <w:rPr>
+                <w:rFonts w:ascii="Times New Roman" w:hAnsi="Times New Roman"/>
+                <w:b/>
+                <w:sz w:val="20"/>
+              </w:rPr>
+              <w:t>R²</w:t>
+            </w:r>
+          </w:p>
+        </w:tc>
+        <w:tc>
+          <w:tcPr>
+            <w:tcW w:type="dxa" w:w="1662"/>
+          </w:tcPr>
+          <w:p>
+            <w:pPr>
+              <w:spacing w:line="240" w:lineRule="auto" w:after="40"/>
+            </w:pPr>
+            <w:r/>
+            <w:r>
+              <w:rPr>
+                <w:rFonts w:ascii="Times New Roman" w:hAnsi="Times New Roman"/>
+                <w:b/>
+                <w:sz w:val="20"/>
+              </w:rPr>
+              <w:t>ρ</w:t>
+            </w:r>
+          </w:p>
+        </w:tc>
+        <w:tc>
+          <w:tcPr>
+            <w:tcW w:type="dxa" w:w="1662"/>
+          </w:tcPr>
+          <w:p>
+            <w:pPr>
+              <w:spacing w:line="240" w:lineRule="auto" w:after="40"/>
+            </w:pPr>
+            <w:r/>
+            <w:r>
+              <w:rPr>
+                <w:rFonts w:ascii="Times New Roman" w:hAnsi="Times New Roman"/>
+                <w:b/>
+                <w:sz w:val="20"/>
+              </w:rPr>
+              <w:t>Weather band (± MT/ha)</w:t>
+            </w:r>
+          </w:p>
+        </w:tc>
+      </w:tr>
+      <w:tr>
+        <w:tc>
+          <w:tcPr>
+            <w:tcW w:type="dxa" w:w="1662"/>
+          </w:tcPr>
+          <w:p>
+            <w:pPr>
+              <w:spacing w:line="240" w:lineRule="auto" w:after="40"/>
+            </w:pPr>
+            <w:r/>
+            <w:r>
+              <w:rPr>
+                <w:rFonts w:ascii="Times New Roman" w:hAnsi="Times New Roman"/>
+                <w:sz w:val="20"/>
+              </w:rPr>
+              <w:t>Pre-season</w:t>
+            </w:r>
+          </w:p>
+        </w:tc>
+        <w:tc>
+          <w:tcPr>
+            <w:tcW w:type="dxa" w:w="1662"/>
+          </w:tcPr>
+          <w:p>
+            <w:pPr>
+              <w:spacing w:line="240" w:lineRule="auto" w:after="40"/>
+            </w:pPr>
+            <w:r/>
+            <w:r>
+              <w:rPr>
+                <w:rFonts w:ascii="Times New Roman" w:hAnsi="Times New Roman"/>
+                <w:sz w:val="20"/>
+              </w:rPr>
+              <w:t>0 of 6</w:t>
+            </w:r>
+          </w:p>
+        </w:tc>
+        <w:tc>
+          <w:tcPr>
+            <w:tcW w:type="dxa" w:w="1662"/>
+          </w:tcPr>
+          <w:p>
+            <w:pPr>
+              <w:spacing w:line="240" w:lineRule="auto" w:after="40"/>
+            </w:pPr>
+            <w:r/>
+            <w:r>
+              <w:rPr>
+                <w:rFonts w:ascii="Times New Roman" w:hAnsi="Times New Roman"/>
+                <w:sz w:val="20"/>
+              </w:rPr>
+              <w:t>−0.273</w:t>
+            </w:r>
+          </w:p>
+        </w:tc>
+        <w:tc>
+          <w:tcPr>
+            <w:tcW w:type="dxa" w:w="1662"/>
+          </w:tcPr>
+          <w:p>
+            <w:pPr>
+              <w:spacing w:line="240" w:lineRule="auto" w:after="40"/>
+            </w:pPr>
+            <w:r/>
+            <w:r>
+              <w:rPr>
+                <w:rFonts w:ascii="Times New Roman" w:hAnsi="Times New Roman"/>
+                <w:sz w:val="20"/>
+              </w:rPr>
+              <w:t>−0.247</w:t>
+            </w:r>
+          </w:p>
+        </w:tc>
+        <w:tc>
+          <w:tcPr>
+            <w:tcW w:type="dxa" w:w="1662"/>
+          </w:tcPr>
+          <w:p>
+            <w:pPr>
+              <w:spacing w:line="240" w:lineRule="auto" w:after="40"/>
+            </w:pPr>
+            <w:r/>
+            <w:r>
+              <w:rPr>
+                <w:rFonts w:ascii="Times New Roman" w:hAnsi="Times New Roman"/>
+                <w:sz w:val="20"/>
+              </w:rPr>
+              <w:t>1.32</w:t>
+            </w:r>
+          </w:p>
+        </w:tc>
+      </w:tr>
+      <w:tr>
+        <w:tc>
+          <w:tcPr>
+            <w:tcW w:type="dxa" w:w="1662"/>
+          </w:tcPr>
+          <w:p>
+            <w:pPr>
+              <w:spacing w:line="240" w:lineRule="auto" w:after="40"/>
+            </w:pPr>
+            <w:r/>
+            <w:r>
+              <w:rPr>
+                <w:rFonts w:ascii="Times New Roman" w:hAnsi="Times New Roman"/>
+                <w:sz w:val="20"/>
+              </w:rPr>
+              <w:t>After June</w:t>
+            </w:r>
+          </w:p>
+        </w:tc>
+        <w:tc>
+          <w:tcPr>
+            <w:tcW w:type="dxa" w:w="1662"/>
+          </w:tcPr>
+          <w:p>
+            <w:pPr>
+              <w:spacing w:line="240" w:lineRule="auto" w:after="40"/>
+            </w:pPr>
+            <w:r/>
+            <w:r>
+              <w:rPr>
+                <w:rFonts w:ascii="Times New Roman" w:hAnsi="Times New Roman"/>
+                <w:sz w:val="20"/>
+              </w:rPr>
+              <w:t>1 of 6</w:t>
+            </w:r>
+          </w:p>
+        </w:tc>
+        <w:tc>
+          <w:tcPr>
+            <w:tcW w:type="dxa" w:w="1662"/>
+          </w:tcPr>
+          <w:p>
+            <w:pPr>
+              <w:spacing w:line="240" w:lineRule="auto" w:after="40"/>
+            </w:pPr>
+            <w:r/>
+            <w:r>
+              <w:rPr>
+                <w:rFonts w:ascii="Times New Roman" w:hAnsi="Times New Roman"/>
+                <w:sz w:val="20"/>
+              </w:rPr>
+              <w:t>−0.270</w:t>
+            </w:r>
+          </w:p>
+        </w:tc>
+        <w:tc>
+          <w:tcPr>
+            <w:tcW w:type="dxa" w:w="1662"/>
+          </w:tcPr>
+          <w:p>
+            <w:pPr>
+              <w:spacing w:line="240" w:lineRule="auto" w:after="40"/>
+            </w:pPr>
+            <w:r/>
+            <w:r>
+              <w:rPr>
+                <w:rFonts w:ascii="Times New Roman" w:hAnsi="Times New Roman"/>
+                <w:sz w:val="20"/>
+              </w:rPr>
+              <w:t>−0.234</w:t>
+            </w:r>
+          </w:p>
+        </w:tc>
+        <w:tc>
+          <w:tcPr>
+            <w:tcW w:type="dxa" w:w="1662"/>
+          </w:tcPr>
+          <w:p>
+            <w:pPr>
+              <w:spacing w:line="240" w:lineRule="auto" w:after="40"/>
+            </w:pPr>
+            <w:r/>
+            <w:r>
+              <w:rPr>
+                <w:rFonts w:ascii="Times New Roman" w:hAnsi="Times New Roman"/>
+                <w:sz w:val="20"/>
+              </w:rPr>
+              <w:t>1.25</w:t>
+            </w:r>
+          </w:p>
+        </w:tc>
+      </w:tr>
+      <w:tr>
+        <w:tc>
+          <w:tcPr>
+            <w:tcW w:type="dxa" w:w="1662"/>
+          </w:tcPr>
+          <w:p>
+            <w:pPr>
+              <w:spacing w:line="240" w:lineRule="auto" w:after="40"/>
+            </w:pPr>
+            <w:r/>
+            <w:r>
+              <w:rPr>
+                <w:rFonts w:ascii="Times New Roman" w:hAnsi="Times New Roman"/>
+                <w:sz w:val="20"/>
+              </w:rPr>
+              <w:t>After July</w:t>
+            </w:r>
+          </w:p>
+        </w:tc>
+        <w:tc>
+          <w:tcPr>
+            <w:tcW w:type="dxa" w:w="1662"/>
+          </w:tcPr>
+          <w:p>
+            <w:pPr>
+              <w:spacing w:line="240" w:lineRule="auto" w:after="40"/>
+            </w:pPr>
+            <w:r/>
+            <w:r>
+              <w:rPr>
+                <w:rFonts w:ascii="Times New Roman" w:hAnsi="Times New Roman"/>
+                <w:sz w:val="20"/>
+              </w:rPr>
+              <w:t>2 of 6</w:t>
+            </w:r>
+          </w:p>
+        </w:tc>
+        <w:tc>
+          <w:tcPr>
+            <w:tcW w:type="dxa" w:w="1662"/>
+          </w:tcPr>
+          <w:p>
+            <w:pPr>
+              <w:spacing w:line="240" w:lineRule="auto" w:after="40"/>
+            </w:pPr>
+            <w:r/>
+            <w:r>
+              <w:rPr>
+                <w:rFonts w:ascii="Times New Roman" w:hAnsi="Times New Roman"/>
+                <w:sz w:val="20"/>
+              </w:rPr>
+              <w:t>−0.267</w:t>
+            </w:r>
+          </w:p>
+        </w:tc>
+        <w:tc>
+          <w:tcPr>
+            <w:tcW w:type="dxa" w:w="1662"/>
+          </w:tcPr>
+          <w:p>
+            <w:pPr>
+              <w:spacing w:line="240" w:lineRule="auto" w:after="40"/>
+            </w:pPr>
+            <w:r/>
+            <w:r>
+              <w:rPr>
+                <w:rFonts w:ascii="Times New Roman" w:hAnsi="Times New Roman"/>
+                <w:sz w:val="20"/>
+              </w:rPr>
+              <w:t>−0.221</w:t>
+            </w:r>
+          </w:p>
+        </w:tc>
+        <w:tc>
+          <w:tcPr>
+            <w:tcW w:type="dxa" w:w="1662"/>
+          </w:tcPr>
+          <w:p>
+            <w:pPr>
+              <w:spacing w:line="240" w:lineRule="auto" w:after="40"/>
+            </w:pPr>
+            <w:r/>
+            <w:r>
+              <w:rPr>
+                <w:rFonts w:ascii="Times New Roman" w:hAnsi="Times New Roman"/>
+                <w:sz w:val="20"/>
+              </w:rPr>
+              <w:t>1.14</w:t>
+            </w:r>
+          </w:p>
+        </w:tc>
+      </w:tr>
+      <w:tr>
+        <w:tc>
+          <w:tcPr>
+            <w:tcW w:type="dxa" w:w="1662"/>
+          </w:tcPr>
+          <w:p>
+            <w:pPr>
+              <w:spacing w:line="240" w:lineRule="auto" w:after="40"/>
+            </w:pPr>
+            <w:r/>
+            <w:r>
+              <w:rPr>
+                <w:rFonts w:ascii="Times New Roman" w:hAnsi="Times New Roman"/>
+                <w:sz w:val="20"/>
+              </w:rPr>
+              <w:t>After August</w:t>
+            </w:r>
+          </w:p>
+        </w:tc>
+        <w:tc>
+          <w:tcPr>
+            <w:tcW w:type="dxa" w:w="1662"/>
+          </w:tcPr>
+          <w:p>
+            <w:pPr>
+              <w:spacing w:line="240" w:lineRule="auto" w:after="40"/>
+            </w:pPr>
+            <w:r/>
+            <w:r>
+              <w:rPr>
+                <w:rFonts w:ascii="Times New Roman" w:hAnsi="Times New Roman"/>
+                <w:sz w:val="20"/>
+              </w:rPr>
+              <w:t>3 of 6</w:t>
+            </w:r>
+          </w:p>
+        </w:tc>
+        <w:tc>
+          <w:tcPr>
+            <w:tcW w:type="dxa" w:w="1662"/>
+          </w:tcPr>
+          <w:p>
+            <w:pPr>
+              <w:spacing w:line="240" w:lineRule="auto" w:after="40"/>
+            </w:pPr>
+            <w:r/>
+            <w:r>
+              <w:rPr>
+                <w:rFonts w:ascii="Times New Roman" w:hAnsi="Times New Roman"/>
+                <w:sz w:val="20"/>
+              </w:rPr>
+              <w:t>−0.265</w:t>
+            </w:r>
+          </w:p>
+        </w:tc>
+        <w:tc>
+          <w:tcPr>
+            <w:tcW w:type="dxa" w:w="1662"/>
+          </w:tcPr>
+          <w:p>
+            <w:pPr>
+              <w:spacing w:line="240" w:lineRule="auto" w:after="40"/>
+            </w:pPr>
+            <w:r/>
+            <w:r>
+              <w:rPr>
+                <w:rFonts w:ascii="Times New Roman" w:hAnsi="Times New Roman"/>
+                <w:sz w:val="20"/>
+              </w:rPr>
+              <w:t>−0.205</w:t>
+            </w:r>
+          </w:p>
+        </w:tc>
+        <w:tc>
+          <w:tcPr>
+            <w:tcW w:type="dxa" w:w="1662"/>
+          </w:tcPr>
+          <w:p>
+            <w:pPr>
+              <w:spacing w:line="240" w:lineRule="auto" w:after="40"/>
+            </w:pPr>
+            <w:r/>
+            <w:r>
+              <w:rPr>
+                <w:rFonts w:ascii="Times New Roman" w:hAnsi="Times New Roman"/>
+                <w:sz w:val="20"/>
+              </w:rPr>
+              <w:t>0.94</w:t>
+            </w:r>
+          </w:p>
+        </w:tc>
+      </w:tr>
+      <w:tr>
+        <w:tc>
+          <w:tcPr>
+            <w:tcW w:type="dxa" w:w="1662"/>
+          </w:tcPr>
+          <w:p>
+            <w:pPr>
+              <w:spacing w:line="240" w:lineRule="auto" w:after="40"/>
+            </w:pPr>
+            <w:r/>
+            <w:r>
+              <w:rPr>
+                <w:rFonts w:ascii="Times New Roman" w:hAnsi="Times New Roman"/>
+                <w:sz w:val="20"/>
+              </w:rPr>
+              <w:t>After September</w:t>
+            </w:r>
+          </w:p>
+        </w:tc>
+        <w:tc>
+          <w:tcPr>
+            <w:tcW w:type="dxa" w:w="1662"/>
+          </w:tcPr>
+          <w:p>
+            <w:pPr>
+              <w:spacing w:line="240" w:lineRule="auto" w:after="40"/>
+            </w:pPr>
+            <w:r/>
+            <w:r>
+              <w:rPr>
+                <w:rFonts w:ascii="Times New Roman" w:hAnsi="Times New Roman"/>
+                <w:sz w:val="20"/>
+              </w:rPr>
+              <w:t>4 of 6</w:t>
+            </w:r>
+          </w:p>
+        </w:tc>
+        <w:tc>
+          <w:tcPr>
+            <w:tcW w:type="dxa" w:w="1662"/>
+          </w:tcPr>
+          <w:p>
+            <w:pPr>
+              <w:spacing w:line="240" w:lineRule="auto" w:after="40"/>
+            </w:pPr>
+            <w:r/>
+            <w:r>
+              <w:rPr>
+                <w:rFonts w:ascii="Times New Roman" w:hAnsi="Times New Roman"/>
+                <w:sz w:val="20"/>
+              </w:rPr>
+              <w:t>−0.258</w:t>
+            </w:r>
+          </w:p>
+        </w:tc>
+        <w:tc>
+          <w:tcPr>
+            <w:tcW w:type="dxa" w:w="1662"/>
+          </w:tcPr>
+          <w:p>
+            <w:pPr>
+              <w:spacing w:line="240" w:lineRule="auto" w:after="40"/>
+            </w:pPr>
+            <w:r/>
+            <w:r>
+              <w:rPr>
+                <w:rFonts w:ascii="Times New Roman" w:hAnsi="Times New Roman"/>
+                <w:sz w:val="20"/>
+              </w:rPr>
+              <w:t>−0.200</w:t>
+            </w:r>
+          </w:p>
+        </w:tc>
+        <w:tc>
+          <w:tcPr>
+            <w:tcW w:type="dxa" w:w="1662"/>
+          </w:tcPr>
+          <w:p>
+            <w:pPr>
+              <w:spacing w:line="240" w:lineRule="auto" w:after="40"/>
+            </w:pPr>
+            <w:r/>
+            <w:r>
+              <w:rPr>
+                <w:rFonts w:ascii="Times New Roman" w:hAnsi="Times New Roman"/>
+                <w:sz w:val="20"/>
+              </w:rPr>
+              <w:t>0.92</w:t>
+            </w:r>
+          </w:p>
+        </w:tc>
+      </w:tr>
+      <w:tr>
+        <w:tc>
+          <w:tcPr>
+            <w:tcW w:type="dxa" w:w="1662"/>
+          </w:tcPr>
+          <w:p>
+            <w:pPr>
+              <w:spacing w:line="240" w:lineRule="auto" w:after="40"/>
+            </w:pPr>
+            <w:r/>
+            <w:r>
+              <w:rPr>
+                <w:rFonts w:ascii="Times New Roman" w:hAnsi="Times New Roman"/>
+                <w:sz w:val="20"/>
+              </w:rPr>
+              <w:t>After October</w:t>
+            </w:r>
+          </w:p>
+        </w:tc>
+        <w:tc>
+          <w:tcPr>
+            <w:tcW w:type="dxa" w:w="1662"/>
+          </w:tcPr>
+          <w:p>
+            <w:pPr>
+              <w:spacing w:line="240" w:lineRule="auto" w:after="40"/>
+            </w:pPr>
+            <w:r/>
+            <w:r>
+              <w:rPr>
+                <w:rFonts w:ascii="Times New Roman" w:hAnsi="Times New Roman"/>
+                <w:sz w:val="20"/>
+              </w:rPr>
+              <w:t>5 of 6</w:t>
+            </w:r>
+          </w:p>
+        </w:tc>
+        <w:tc>
+          <w:tcPr>
+            <w:tcW w:type="dxa" w:w="1662"/>
+          </w:tcPr>
+          <w:p>
+            <w:pPr>
+              <w:spacing w:line="240" w:lineRule="auto" w:after="40"/>
+            </w:pPr>
+            <w:r/>
+            <w:r>
+              <w:rPr>
+                <w:rFonts w:ascii="Times New Roman" w:hAnsi="Times New Roman"/>
+                <w:sz w:val="20"/>
+              </w:rPr>
+              <w:t>−0.272</w:t>
+            </w:r>
+          </w:p>
+        </w:tc>
+        <w:tc>
+          <w:tcPr>
+            <w:tcW w:type="dxa" w:w="1662"/>
+          </w:tcPr>
+          <w:p>
+            <w:pPr>
+              <w:spacing w:line="240" w:lineRule="auto" w:after="40"/>
+            </w:pPr>
+            <w:r/>
+            <w:r>
+              <w:rPr>
+                <w:rFonts w:ascii="Times New Roman" w:hAnsi="Times New Roman"/>
+                <w:sz w:val="20"/>
+              </w:rPr>
+              <w:t>−0.222</w:t>
+            </w:r>
+          </w:p>
+        </w:tc>
+        <w:tc>
+          <w:tcPr>
+            <w:tcW w:type="dxa" w:w="1662"/>
+          </w:tcPr>
+          <w:p>
+            <w:pPr>
+              <w:spacing w:line="240" w:lineRule="auto" w:after="40"/>
+            </w:pPr>
+            <w:r/>
+            <w:r>
+              <w:rPr>
+                <w:rFonts w:ascii="Times New Roman" w:hAnsi="Times New Roman"/>
+                <w:sz w:val="20"/>
+              </w:rPr>
+              <w:t>0.66</w:t>
+            </w:r>
+          </w:p>
+        </w:tc>
+      </w:tr>
+      <w:tr>
+        <w:tc>
+          <w:tcPr>
+            <w:tcW w:type="dxa" w:w="1662"/>
+          </w:tcPr>
+          <w:p>
+            <w:pPr>
+              <w:spacing w:line="240" w:lineRule="auto" w:after="40"/>
+            </w:pPr>
+            <w:r/>
+            <w:r>
+              <w:rPr>
+                <w:rFonts w:ascii="Times New Roman" w:hAnsi="Times New Roman"/>
+                <w:sz w:val="20"/>
+              </w:rPr>
+              <w:t>After November (hindcast)</w:t>
+            </w:r>
+          </w:p>
+        </w:tc>
+        <w:tc>
+          <w:tcPr>
+            <w:tcW w:type="dxa" w:w="1662"/>
+          </w:tcPr>
+          <w:p>
+            <w:pPr>
+              <w:spacing w:line="240" w:lineRule="auto" w:after="40"/>
+            </w:pPr>
+            <w:r/>
+            <w:r>
+              <w:rPr>
+                <w:rFonts w:ascii="Times New Roman" w:hAnsi="Times New Roman"/>
+                <w:sz w:val="20"/>
+              </w:rPr>
+              <w:t>6 of 6</w:t>
+            </w:r>
+          </w:p>
+        </w:tc>
+        <w:tc>
+          <w:tcPr>
+            <w:tcW w:type="dxa" w:w="1662"/>
+          </w:tcPr>
+          <w:p>
+            <w:pPr>
+              <w:spacing w:line="240" w:lineRule="auto" w:after="40"/>
+            </w:pPr>
+            <w:r/>
+            <w:r>
+              <w:rPr>
+                <w:rFonts w:ascii="Times New Roman" w:hAnsi="Times New Roman"/>
+                <w:sz w:val="20"/>
+              </w:rPr>
+              <w:t>−0.237</w:t>
+            </w:r>
+          </w:p>
+        </w:tc>
+        <w:tc>
+          <w:tcPr>
+            <w:tcW w:type="dxa" w:w="1662"/>
+          </w:tcPr>
+          <w:p>
+            <w:pPr>
+              <w:spacing w:line="240" w:lineRule="auto" w:after="40"/>
+            </w:pPr>
+            <w:r/>
+            <w:r>
+              <w:rPr>
+                <w:rFonts w:ascii="Times New Roman" w:hAnsi="Times New Roman"/>
+                <w:sz w:val="20"/>
+              </w:rPr>
+              <w:t>−0.191</w:t>
+            </w:r>
+          </w:p>
+        </w:tc>
+        <w:tc>
+          <w:tcPr>
+            <w:tcW w:type="dxa" w:w="1662"/>
+          </w:tcPr>
+          <w:p>
+            <w:pPr>
+              <w:spacing w:line="240" w:lineRule="auto" w:after="40"/>
+            </w:pPr>
+            <w:r/>
+            <w:r>
+              <w:rPr>
+                <w:rFonts w:ascii="Times New Roman" w:hAnsi="Times New Roman"/>
+                <w:sz w:val="20"/>
+              </w:rPr>
+              <w:t>0.00</w:t>
+            </w:r>
+          </w:p>
+        </w:tc>
+      </w:tr>
+      <w:tr>
+        <w:tc>
+          <w:tcPr>
+            <w:tcW w:type="dxa" w:w="1662"/>
+          </w:tcPr>
+          <w:p>
+            <w:pPr>
+              <w:spacing w:line="240" w:lineRule="auto" w:after="40"/>
+            </w:pPr>
+            <w:r/>
+            <w:r>
+              <w:rPr>
+                <w:rFonts w:ascii="Times New Roman" w:hAnsi="Times New Roman"/>
+                <w:sz w:val="20"/>
+              </w:rPr>
+              <w:t>Climatology, using no features</w:t>
+            </w:r>
+          </w:p>
+        </w:tc>
+        <w:tc>
+          <w:tcPr>
+            <w:tcW w:type="dxa" w:w="1662"/>
+          </w:tcPr>
+          <w:p>
+            <w:pPr>
+              <w:spacing w:line="240" w:lineRule="auto" w:after="40"/>
+            </w:pPr>
+            <w:r/>
+            <w:r>
+              <w:rPr>
+                <w:rFonts w:ascii="Times New Roman" w:hAnsi="Times New Roman"/>
+                <w:sz w:val="20"/>
+              </w:rPr>
+              <w:t>—</w:t>
+            </w:r>
+          </w:p>
+        </w:tc>
+        <w:tc>
+          <w:tcPr>
+            <w:tcW w:type="dxa" w:w="1662"/>
+          </w:tcPr>
+          <w:p>
+            <w:pPr>
+              <w:spacing w:line="240" w:lineRule="auto" w:after="40"/>
+            </w:pPr>
+            <w:r/>
+            <w:r>
+              <w:rPr>
+                <w:rFonts w:ascii="Times New Roman" w:hAnsi="Times New Roman"/>
+                <w:sz w:val="20"/>
+              </w:rPr>
+              <w:t>−0.215</w:t>
+            </w:r>
+          </w:p>
+        </w:tc>
+        <w:tc>
+          <w:tcPr>
+            <w:tcW w:type="dxa" w:w="1662"/>
+          </w:tcPr>
+          <w:p>
+            <w:pPr>
+              <w:spacing w:line="240" w:lineRule="auto" w:after="40"/>
+            </w:pPr>
+            <w:r/>
+            <w:r>
+              <w:rPr>
+                <w:rFonts w:ascii="Times New Roman" w:hAnsi="Times New Roman"/>
+                <w:sz w:val="20"/>
+              </w:rPr>
+              <w:t>—</w:t>
+            </w:r>
+          </w:p>
+        </w:tc>
+        <w:tc>
+          <w:tcPr>
+            <w:tcW w:type="dxa" w:w="1662"/>
+          </w:tcPr>
+          <w:p>
+            <w:pPr>
+              <w:spacing w:line="240" w:lineRule="auto" w:after="40"/>
+            </w:pPr>
+            <w:r/>
+            <w:r>
+              <w:rPr>
+                <w:rFonts w:ascii="Times New Roman" w:hAnsi="Times New Roman"/>
+                <w:sz w:val="20"/>
+              </w:rPr>
+              <w:t>—</w:t>
+            </w:r>
+          </w:p>
+        </w:tc>
+      </w:tr>
+    </w:tbl>
+    <w:p>
+      <w:pPr>
+        <w:spacing w:after="120"/>
+      </w:pPr>
+    </w:p>
+    <w:p>
+      <w:pPr>
+        <w:jc w:val="center"/>
+      </w:pPr>
+      <w:r>
+        <w:drawing>
+          <wp:inline xmlns:a="http://schemas.openxmlformats.org/drawingml/2006/main" xmlns:pic="http://schemas.openxmlformats.org/drawingml/2006/picture">
+            <wp:extent cx="5029200" cy="1894432"/>
+            <wp:docPr id="12" name="Picture 12"/>
+            <wp:cNvGraphicFramePr>
+              <a:graphicFrameLocks noChangeAspect="1"/>
+            </wp:cNvGraphicFramePr>
+            <a:graphic>
+              <a:graphicData uri="http://schemas.openxmlformats.org/drawingml/2006/picture">
+                <pic:pic>
+                  <pic:nvPicPr>
+                    <pic:cNvPr id="0" name="forecast_leadtime.png"/>
+                    <pic:cNvPicPr/>
+                  </pic:nvPicPr>
+                  <pic:blipFill>
+                    <a:blip r:embed="rId23"/>
+                    <a:stretch>
+                      <a:fillRect/>
+                    </a:stretch>
+                  </pic:blipFill>
+                  <pic:spPr>
+                    <a:xfrm>
+                      <a:off x="0" y="0"/>
+                      <a:ext cx="5029200" cy="1894432"/>
+                    </a:xfrm>
+                    <a:prstGeom prst="rect"/>
+                  </pic:spPr>
+                </pic:pic>
+              </a:graphicData>
+            </a:graphic>
+          </wp:inline>
+        </w:drawing>
+      </w:r>
+    </w:p>
+    <w:p>
+      <w:pPr>
+        <w:spacing w:after="240"/>
+        <w:jc w:val="center"/>
+      </w:pPr>
+      <w:r>
+        <w:rPr>
+          <w:rFonts w:ascii="Times New Roman" w:hAnsi="Times New Roman"/>
+          <w:i/>
+          <w:sz w:val="22"/>
+        </w:rPr>
+        <w:t>Figure 7.6: Skill against forecast issue point, and the weather uncertainty that shrinks as the season is observed</w:t>
+      </w:r>
+    </w:p>
+    <w:p>
+      <w:pPr>
+        <w:jc w:val="both"/>
+      </w:pPr>
+      <w:r>
+        <w:rPr>
+          <w:rFonts w:ascii="Times New Roman" w:hAnsi="Times New Roman"/>
+          <w:sz w:val="24"/>
+        </w:rPr>
+        <w:t>The uncertainty machinery behaves exactly as it should: the weather band contracts monotonically from plus or minus 1.32 metric tons per hectare before the season to precisely zero once every month is observed. The skill does not. At no issue point does the weather-informed forecast beat climatology, and the correlation between forecast and outcome is negative throughout. Observing the entire season leaves the forecaster no better off than knowing nothing about it.</w:t>
+      </w:r>
+    </w:p>
+    <w:p>
+      <w:pPr>
+        <w:jc w:val="both"/>
+      </w:pPr>
+      <w:r>
+        <w:rPr>
+          <w:rFonts w:ascii="Times New Roman" w:hAnsi="Times New Roman"/>
+          <w:sz w:val="24"/>
+        </w:rPr>
+        <w:t>A decomposition explains why. Holding all else at the district mean and varying one group at a time, the weather features move the prediction by 0.35 to 0.76 metric tons per hectare, the satellite features by 0.54 to 1.35, and the two together with their interactions by 1.84 to 2.99. Weather, the quantity the system exists to exploit, is the weakest of the unknown inputs. The models are driven mainly by district-constant soil terms and lagged yields, which is consistent with section 7.5: only 2.2 per cent of the target's variance lies between districts, and the year effect that dominates it is precisely what the protocol removes.</w:t>
+      </w:r>
+    </w:p>
+    <w:p>
+      <w:pPr>
+        <w:keepNext/>
+        <w:spacing w:before="240" w:after="120"/>
       </w:pPr>
       <w:r>
         <w:rPr>
@@ -23126,7 +24119,7 @@
           <w:b/>
           <w:sz w:val="24"/>
         </w:rPr>
-        <w:t>7.13 Summary</w:t>
+        <w:t>7.13 Decision Value and the Break-Even Skill Frontier</w:t>
       </w:r>
     </w:p>
     <w:p>
@@ -23138,6 +24131,183 @@
           <w:rFonts w:ascii="Times New Roman" w:hAnsi="Times New Roman"/>
           <w:sz w:val="24"/>
         </w:rPr>
+        <w:t>Because accuracy on this panel is not recoverable, the more useful question is what accuracy would have to be attained before a forecast is worth acting on. That threshold can be derived without a good model, which is why it survives the results above.</w:t>
+      </w:r>
+    </w:p>
+    <w:p>
+      <w:pPr>
+        <w:jc w:val="both"/>
+      </w:pPr>
+      <w:r>
+        <w:rPr>
+          <w:rFonts w:ascii="Times New Roman" w:hAnsi="Times New Roman"/>
+          <w:sz w:val="24"/>
+        </w:rPr>
+        <w:t>For a perishable bulb crop the cost of being wrong is not exogenous to the model. Curing-window humidity drives both the yield being predicted and the fraction of the harvest that survives ambient storage; tropical onion loses twenty to forty per cent under the ambient conditions in which it is held. The cost of over-procuring is therefore a function of the model's own covariates, and the newsvendor critical fractile moves with the weather rather than being the constant that published crop-forecast-value studies assume. Across curing-humidity and export-restriction states it ranges from 0.649 to 0.960.</w:t>
+      </w:r>
+    </w:p>
+    <w:p>
+      <w:pPr>
+        <w:jc w:val="both"/>
+      </w:pPr>
+      <w:r>
+        <w:rPr>
+          <w:rFonts w:ascii="Times New Roman" w:hAnsi="Times New Roman"/>
+          <w:sz w:val="24"/>
+        </w:rPr>
+        <w:t>Paddy cannot pose this question. Milled grain keeps at approximately ninety-five per cent independently of growing-season weather, and the Guaranteed Price Scheme truncates the downside, placing it near a fractile of 0.5 where the coupling term is identically zero. The distinction is mechanical rather than rhetorical, and it is the sense in which this analysis is specific to onion rather than transferred from a cereal.</w:t>
+      </w:r>
+    </w:p>
+    <w:p>
+      <w:pPr>
+        <w:jc w:val="both"/>
+      </w:pPr>
+      <w:r>
+        <w:rPr>
+          <w:rFonts w:ascii="Times New Roman" w:hAnsi="Times New Roman"/>
+          <w:sz w:val="24"/>
+        </w:rPr>
+        <w:t>From the coupled loss follows the break-even skill frontier: the minimum forecast-outcome correlation at which acting on the forecast beats acting on climatology. Calibrated in-fold, that threshold lies between 0.00 and 0.22; used raw it rises to between 0.39 and 0.48. The gap matters because the fitted predictions are over-dispersed, their standard deviation being 0.407 of the target's against a correlation of 0.258, implying a shrink slope of 0.634. The same forecast reduces expected decision loss by 3.9 per cent when recalibrated and increases it by approximately fifty-three per cent when used raw. The difference between a useful forecast and a harmful one here is a one-line recalibration, not a different architecture.</w:t>
+      </w:r>
+    </w:p>
+    <w:p>
+      <w:pPr>
+        <w:jc w:val="center"/>
+      </w:pPr>
+      <w:r>
+        <w:drawing>
+          <wp:inline xmlns:a="http://schemas.openxmlformats.org/drawingml/2006/main" xmlns:pic="http://schemas.openxmlformats.org/drawingml/2006/picture">
+            <wp:extent cx="5029200" cy="1915623"/>
+            <wp:docPr id="13" name="Picture 13"/>
+            <wp:cNvGraphicFramePr>
+              <a:graphicFrameLocks noChangeAspect="1"/>
+            </wp:cNvGraphicFramePr>
+            <a:graphic>
+              <a:graphicData uri="http://schemas.openxmlformats.org/drawingml/2006/picture">
+                <pic:pic>
+                  <pic:nvPicPr>
+                    <pic:cNvPr id="0" name="decision_skill_scissors.png"/>
+                    <pic:cNvPicPr/>
+                  </pic:nvPicPr>
+                  <pic:blipFill>
+                    <a:blip r:embed="rId24"/>
+                    <a:stretch>
+                      <a:fillRect/>
+                    </a:stretch>
+                  </pic:blipFill>
+                  <pic:spPr>
+                    <a:xfrm>
+                      <a:off x="0" y="0"/>
+                      <a:ext cx="5029200" cy="1915623"/>
+                    </a:xfrm>
+                    <a:prstGeom prst="rect"/>
+                  </pic:spPr>
+                </pic:pic>
+              </a:graphicData>
+            </a:graphic>
+          </wp:inline>
+        </w:drawing>
+      </w:r>
+    </w:p>
+    <w:p>
+      <w:pPr>
+        <w:spacing w:after="240"/>
+        <w:jc w:val="center"/>
+      </w:pPr>
+      <w:r>
+        <w:rPr>
+          <w:rFonts w:ascii="Times New Roman" w:hAnsi="Times New Roman"/>
+          <w:i/>
+          <w:sz w:val="22"/>
+        </w:rPr>
+        <w:t>Figure 7.7: Required forecast skill against attainable skill, and the decision-loss consequence of leaving predictions uncalibrated</w:t>
+      </w:r>
+    </w:p>
+    <w:p>
+      <w:pPr>
+        <w:jc w:val="both"/>
+      </w:pPr>
+      <w:r>
+        <w:rPr>
+          <w:rFonts w:ascii="Times New Roman" w:hAnsi="Times New Roman"/>
+          <w:sz w:val="24"/>
+        </w:rPr>
+        <w:t>One hypothesis was tested and refuted. It was predicted that the required skill would rise with the extremity of the critical fractile, so that asymmetric-loss crops would need more accuracy before forecasting became worthwhile. Simulation on this project's own residuals shows the threshold mildly falling instead, from 0.145 at a fractile of 0.55 to 0.115 at 0.94. The prediction is recorded here as refuted rather than omitted.</w:t>
+      </w:r>
+    </w:p>
+    <w:p>
+      <w:pPr>
+        <w:jc w:val="both"/>
+      </w:pPr>
+      <w:r>
+        <w:rPr>
+          <w:rFonts w:ascii="Times New Roman" w:hAnsi="Times New Roman"/>
+          <w:sz w:val="24"/>
+        </w:rPr>
+        <w:t>Set against the attainable skill of section 7.12, where the correlation is negative at every issue point, the two curves do not cross. On this data design there is no forecast issue point at which acting on the model beats acting on the district's climatological mean. That is a quantitative conclusion rather than an absence of one, and it is the result this chapter is able to defend.</w:t>
+      </w:r>
+    </w:p>
+    <w:p>
+      <w:pPr>
+        <w:keepNext/>
+        <w:spacing w:before="240" w:after="120"/>
+      </w:pPr>
+      <w:r>
+        <w:rPr>
+          <w:rFonts w:ascii="Times New Roman" w:hAnsi="Times New Roman"/>
+          <w:b/>
+          <w:sz w:val="24"/>
+        </w:rPr>
+        <w:t>7.14 Per-District Behaviour</w:t>
+      </w:r>
+    </w:p>
+    <w:p>
+      <w:pPr>
+        <w:jc w:val="both"/>
+      </w:pPr>
+      <w:r>
+        <w:rPr>
+          <w:rFonts w:ascii="Times New Roman" w:hAnsi="Times New Roman"/>
+          <w:sz w:val="24"/>
+        </w:rPr>
+        <w:t>District-level differences are small and, given section 7.5, expected to be: only 2.2 per cent of the target's variance lies between districts. The estimated district offsets span 0.34 metric tons per hectare in total, which is smaller than the measurement error of a single cell.</w:t>
+      </w:r>
+    </w:p>
+    <w:p>
+      <w:pPr>
+        <w:jc w:val="both"/>
+      </w:pPr>
+      <w:r>
+        <w:rPr>
+          <w:rFonts w:ascii="Times New Roman" w:hAnsi="Times New Roman"/>
+          <w:sz w:val="24"/>
+        </w:rPr>
+        <w:t>Kurunegala warrants separate comment. Its harvested extent ranges from 3.5 to 59 hectares against Matale's 104 to 1,765, so its yield estimates are inherently the noisiest in the panel; it shares a weather grid cell with Matale, so it has no independent meteorological observation; its vegetation index is a Matale proxy, no MODIS export being available; and its soil profile is absent from the SoilGrids export. Its apparent difficulty in the interim report is therefore substantially an artefact of observation quality rather than a property of the district's agronomy. The extent weighting introduced in section 7.3 down-weights it accordingly.</w:t>
+      </w:r>
+    </w:p>
+    <w:p>
+      <w:pPr>
+        <w:keepNext/>
+        <w:spacing w:before="240" w:after="120"/>
+      </w:pPr>
+      <w:r>
+        <w:rPr>
+          <w:rFonts w:ascii="Times New Roman" w:hAnsi="Times New Roman"/>
+          <w:b/>
+          <w:sz w:val="24"/>
+        </w:rPr>
+        <w:t>7.15 Summary</w:t>
+      </w:r>
+    </w:p>
+    <w:p>
+      <w:pPr>
+        <w:jc w:val="both"/>
+      </w:pPr>
+      <w:r>
+        <w:rPr>
+          <w:rFonts w:ascii="Times New Roman" w:hAnsi="Times New Roman"/>
+          <w:sz w:val="24"/>
+        </w:rPr>
         <w:t>The dataset used in the interim report carried a target that was approximately forty per cent fabricated. It has been rebuilt from eighty-seven genuine DCS records using the standard definition of yield, correlating with its predecessor at 0.68. Six physically impossible records were excluded and four look-ahead leaks removed.</w:t>
       </w:r>
     </w:p>
@@ -23175,6 +24345,30 @@
           <w:sz w:val="24"/>
         </w:rPr>
         <w:t>Of the model's four design claims, learning the agronomic coefficients and shrinking them moderately toward literature are supported; thermal time indexing and the waterlogging term are not. The estimated coefficients are stable across folds and agronomically plausible, and the comparison against their published values shows that FAO-33 materially overstates weather sensitivity for this crop and irrigation regime.</w:t>
+      </w:r>
+    </w:p>
+    <w:p>
+      <w:pPr>
+        <w:jc w:val="both"/>
+      </w:pPr>
+      <w:r>
+        <w:rPr>
+          <w:rFonts w:ascii="Times New Roman" w:hAnsi="Times New Roman"/>
+          <w:sz w:val="24"/>
+        </w:rPr>
+        <w:t>Re-evaluating the system as a forecast rather than a retrospective fit removes the last of its apparent skill. Only nine of the thirty-two features can be known before a season begins, and propagating the unknown weather through a forty-five-year analogue pool shows the forecast failing to beat climatology at every issue point, with a negative correlation to the outcome throughout. The weather channel moves the prediction less than the satellite channel does, so the quantity the system exists to exploit is the weakest input it has.</w:t>
+      </w:r>
+    </w:p>
+    <w:p>
+      <w:pPr>
+        <w:jc w:val="both"/>
+      </w:pPr>
+      <w:r>
+        <w:rPr>
+          <w:rFonts w:ascii="Times New Roman" w:hAnsi="Times New Roman"/>
+          <w:sz w:val="24"/>
+        </w:rPr>
+        <w:t>The decision analysis converts that into a threshold rather than a complaint. Because curing-window humidity drives both yield and storage survival, the critical fractile is itself a function of the model's covariates and ranges from 0.649 to 0.960 — a coupling a cereal cannot exhibit. The skill required before acting on a forecast beats acting on climatology lies between 0.00 and 0.22 when predictions are recalibrated and between 0.39 and 0.48 when they are not. Attainable skill is negative. The two curves do not cross, and that non-crossing is the chapter's defensible conclusion.</w:t>
       </w:r>
     </w:p>
     <w:p>

</xml_diff>

<commit_message>
Add viva assets and final figure tooling
Introduces new viva and presentation deliverables, including a full model-building viva guide, poster content, and generated deck/poster/figure assets. Adds scripts to build and preview the final presentation and to regenerate corrected final-report schematics. Updates reporting code to use new final figure paths and captions, improves PADR figure labeling/layout, and persists deep-learning per-epoch history JSON so learning-curve artifacts are reproducible and traceable.
</commit_message>
<xml_diff>
--- a/outputs/Final_Report_AgroAI.docx
+++ b/outputs/Final_Report_AgroAI.docx
@@ -10848,7 +10848,7 @@
       <w:r>
         <w:drawing>
           <wp:inline xmlns:a="http://schemas.openxmlformats.org/drawingml/2006/main" xmlns:pic="http://schemas.openxmlformats.org/drawingml/2006/picture">
-            <wp:extent cx="5029200" cy="2496509"/>
+            <wp:extent cx="5029200" cy="3045182"/>
             <wp:docPr id="1" name="Picture 1"/>
             <wp:cNvGraphicFramePr>
               <a:graphicFrameLocks noChangeAspect="1"/>
@@ -10869,7 +10869,7 @@
                   <pic:spPr>
                     <a:xfrm>
                       <a:off x="0" y="0"/>
-                      <a:ext cx="5029200" cy="2496509"/>
+                      <a:ext cx="5029200" cy="3045182"/>
                     </a:xfrm>
                     <a:prstGeom prst="rect"/>
                   </pic:spPr>
@@ -10927,7 +10927,7 @@
       <w:r>
         <w:drawing>
           <wp:inline xmlns:a="http://schemas.openxmlformats.org/drawingml/2006/main" xmlns:pic="http://schemas.openxmlformats.org/drawingml/2006/picture">
-            <wp:extent cx="5029200" cy="3222547"/>
+            <wp:extent cx="5029200" cy="3685457"/>
             <wp:docPr id="2" name="Picture 2"/>
             <wp:cNvGraphicFramePr>
               <a:graphicFrameLocks noChangeAspect="1"/>
@@ -10948,7 +10948,7 @@
                   <pic:spPr>
                     <a:xfrm>
                       <a:off x="0" y="0"/>
-                      <a:ext cx="5029200" cy="3222547"/>
+                      <a:ext cx="5029200" cy="3685457"/>
                     </a:xfrm>
                     <a:prstGeom prst="rect"/>
                   </pic:spPr>
@@ -11215,7 +11215,7 @@
       <w:r>
         <w:drawing>
           <wp:inline xmlns:a="http://schemas.openxmlformats.org/drawingml/2006/main" xmlns:pic="http://schemas.openxmlformats.org/drawingml/2006/picture">
-            <wp:extent cx="5029200" cy="3341549"/>
+            <wp:extent cx="5029200" cy="3480557"/>
             <wp:docPr id="3" name="Picture 3"/>
             <wp:cNvGraphicFramePr>
               <a:graphicFrameLocks noChangeAspect="1"/>
@@ -11236,7 +11236,7 @@
                   <pic:spPr>
                     <a:xfrm>
                       <a:off x="0" y="0"/>
-                      <a:ext cx="5029200" cy="3341549"/>
+                      <a:ext cx="5029200" cy="3480557"/>
                     </a:xfrm>
                     <a:prstGeom prst="rect"/>
                   </pic:spPr>
@@ -12770,7 +12770,7 @@
       <w:r>
         <w:drawing>
           <wp:inline xmlns:a="http://schemas.openxmlformats.org/drawingml/2006/main" xmlns:pic="http://schemas.openxmlformats.org/drawingml/2006/picture">
-            <wp:extent cx="5029200" cy="3729034"/>
+            <wp:extent cx="5029200" cy="3907516"/>
             <wp:docPr id="4" name="Picture 4"/>
             <wp:cNvGraphicFramePr>
               <a:graphicFrameLocks noChangeAspect="1"/>
@@ -12791,7 +12791,7 @@
                   <pic:spPr>
                     <a:xfrm>
                       <a:off x="0" y="0"/>
-                      <a:ext cx="5029200" cy="3729034"/>
+                      <a:ext cx="5029200" cy="3907516"/>
                     </a:xfrm>
                     <a:prstGeom prst="rect"/>
                   </pic:spPr>
@@ -13059,7 +13059,7 @@
       <w:r>
         <w:drawing>
           <wp:inline xmlns:a="http://schemas.openxmlformats.org/drawingml/2006/main" xmlns:pic="http://schemas.openxmlformats.org/drawingml/2006/picture">
-            <wp:extent cx="5029200" cy="3452962"/>
+            <wp:extent cx="5029200" cy="3287526"/>
             <wp:docPr id="5" name="Picture 5"/>
             <wp:cNvGraphicFramePr>
               <a:graphicFrameLocks noChangeAspect="1"/>
@@ -13068,7 +13068,7 @@
               <a:graphicData uri="http://schemas.openxmlformats.org/drawingml/2006/picture">
                 <pic:pic>
                   <pic:nvPicPr>
-                    <pic:cNvPr id="0" name="figure_5_3_database_schema.png"/>
+                    <pic:cNvPr id="0" name="figure_5_3_artefact_schema.png"/>
                     <pic:cNvPicPr/>
                   </pic:nvPicPr>
                   <pic:blipFill>
@@ -13080,7 +13080,7 @@
                   <pic:spPr>
                     <a:xfrm>
                       <a:off x="0" y="0"/>
-                      <a:ext cx="5029200" cy="3452962"/>
+                      <a:ext cx="5029200" cy="3287526"/>
                     </a:xfrm>
                     <a:prstGeom prst="rect"/>
                   </pic:spPr>
@@ -13102,7 +13102,7 @@
           <w:i/>
           <w:sz w:val="22"/>
         </w:rPr>
-        <w:t>Figure 5.3: Logical data schema of the processed store</w:t>
+        <w:t>Figure 5.3: Logical schema of the persisted artefact store</w:t>
       </w:r>
     </w:p>
     <w:p>
@@ -14505,7 +14505,19 @@
           <w:rFonts w:ascii="Times New Roman" w:hAnsi="Times New Roman"/>
           <w:sz w:val="24"/>
         </w:rPr>
-        <w:t>Figure 6.1 shows the training curve of the hybrid on the collected data. The behaviour it displays is itself a finding: the validation loss separates from the training loss early and does not recover, which is the signature of a model with more capacity than the sample can constrain. This is consistent with the quantitative outcome reported in section 7.4.</w:t>
+        <w:t>Figure 6.1 shows the loss trace of the hybrid on the final leave-one-year-out fold of the collected data. Two features of it are themselves findings. The first is the persistent gap: validation loss settles near three times training loss and stays there, which is the signature of a model with more capacity than the sample can constrain, and is consistent with the quantitative outcome in section 7.4. The second is that the run terminated on the fifty-epoch cap rather than on the early-stopping criterion, with validation loss still descending. The cap is the synthetic-mode setting, which the real-data run inherits; the networks were therefore not trained to convergence, and the deep-model figures in chapter 7 should be read as a lower bound on what these architectures would reach with an uncapped budget. Given the leave-one-year-out ceiling established in section 7.1 this would not change the ranking, but it is a limitation of the run rather than of the architecture.</w:t>
+      </w:r>
+    </w:p>
+    <w:p>
+      <w:pPr>
+        <w:jc w:val="both"/>
+      </w:pPr>
+      <w:r>
+        <w:rPr>
+          <w:rFonts w:ascii="Times New Roman" w:hAnsi="Times New Roman"/>
+          <w:sz w:val="24"/>
+        </w:rPr>
+        <w:t>The trace should be read for shape only, not as an estimate of generalisation. It comes from one fold, and its validation split is fifteen per cent of roughly twenty-four training records, which is three or four points.</w:t>
       </w:r>
     </w:p>
     <w:p>
@@ -14515,7 +14527,7 @@
       <w:r>
         <w:drawing>
           <wp:inline xmlns:a="http://schemas.openxmlformats.org/drawingml/2006/main" xmlns:pic="http://schemas.openxmlformats.org/drawingml/2006/picture">
-            <wp:extent cx="5029200" cy="3143250"/>
+            <wp:extent cx="5029200" cy="3003576"/>
             <wp:docPr id="6" name="Picture 6"/>
             <wp:cNvGraphicFramePr>
               <a:graphicFrameLocks noChangeAspect="1"/>
@@ -14524,7 +14536,7 @@
               <a:graphicData uri="http://schemas.openxmlformats.org/drawingml/2006/picture">
                 <pic:pic>
                   <pic:nvPicPr>
-                    <pic:cNvPr id="0" name="cnn_lstm_learning_curve.png"/>
+                    <pic:cNvPr id="0" name="figure_6_1_hybrid_learning_curve.png"/>
                     <pic:cNvPicPr/>
                   </pic:nvPicPr>
                   <pic:blipFill>
@@ -14536,7 +14548,7 @@
                   <pic:spPr>
                     <a:xfrm>
                       <a:off x="0" y="0"/>
-                      <a:ext cx="5029200" cy="3143250"/>
+                      <a:ext cx="5029200" cy="3003576"/>
                     </a:xfrm>
                     <a:prstGeom prst="rect"/>
                   </pic:spPr>
@@ -14558,7 +14570,7 @@
           <w:i/>
           <w:sz w:val="22"/>
         </w:rPr>
-        <w:t>Figure 6.1: Training curve of the hybrid CNN-LSTM on the collected data</w:t>
+        <w:t>Figure 6.1: Loss trace of the hybrid CNN-LSTM on the final leave-one-year-out fold of the collected data</w:t>
       </w:r>
     </w:p>
     <w:p>
@@ -18302,7 +18314,7 @@
       <w:r>
         <w:drawing>
           <wp:inline xmlns:a="http://schemas.openxmlformats.org/drawingml/2006/main" xmlns:pic="http://schemas.openxmlformats.org/drawingml/2006/picture">
-            <wp:extent cx="5029200" cy="2684986"/>
+            <wp:extent cx="5029200" cy="2682988"/>
             <wp:docPr id="8" name="Picture 8"/>
             <wp:cNvGraphicFramePr>
               <a:graphicFrameLocks noChangeAspect="1"/>
@@ -18323,7 +18335,7 @@
                   <pic:spPr>
                     <a:xfrm>
                       <a:off x="0" y="0"/>
-                      <a:ext cx="5029200" cy="2684986"/>
+                      <a:ext cx="5029200" cy="2682988"/>
                     </a:xfrm>
                     <a:prstGeom prst="rect"/>
                   </pic:spPr>
@@ -20928,7 +20940,7 @@
       <w:r>
         <w:drawing>
           <wp:inline xmlns:a="http://schemas.openxmlformats.org/drawingml/2006/main" xmlns:pic="http://schemas.openxmlformats.org/drawingml/2006/picture">
-            <wp:extent cx="5029200" cy="1918922"/>
+            <wp:extent cx="5029200" cy="1909020"/>
             <wp:docPr id="10" name="Picture 10"/>
             <wp:cNvGraphicFramePr>
               <a:graphicFrameLocks noChangeAspect="1"/>
@@ -20949,7 +20961,7 @@
                   <pic:spPr>
                     <a:xfrm>
                       <a:off x="0" y="0"/>
-                      <a:ext cx="5029200" cy="1918922"/>
+                      <a:ext cx="5029200" cy="1909020"/>
                     </a:xfrm>
                     <a:prstGeom prst="rect"/>
                   </pic:spPr>
@@ -32217,7 +32229,7 @@
           <w:rFonts w:ascii="Times New Roman" w:hAnsi="Times New Roman"/>
           <w:sz w:val="24"/>
         </w:rPr>
-        <w:t>Table C.3 gives the complete top-fifteen mean absolute SHAP attribution ranking summarised in section 7.11 and plotted in Figure 7.5.</w:t>
+        <w:t>Table C.3 gives the complete top-fifteen mean absolute SHAP attribution ranking summarised in section 7.11.</w:t>
       </w:r>
     </w:p>
     <w:p>

</xml_diff>